<commit_message>
Updated Week 2 report
</commit_message>
<xml_diff>
--- a/reports/Weekly_Report_Week2.docx
+++ b/reports/Weekly_Report_Week2.docx
@@ -8,7 +8,10 @@
         <w:ind w:left="142" w:right="-592"/>
       </w:pPr>
       <w:r>
-        <w:t>Weekly Report — Week 1</w:t>
+        <w:t xml:space="preserve">Weekly Report — Week </w:t>
+      </w:r>
+      <w:r>
+        <w:t>2</w:t>
       </w:r>
     </w:p>
     <w:p>
@@ -53,7 +56,13 @@
         <w:ind w:left="142" w:right="-592"/>
       </w:pPr>
       <w:r>
-        <w:t>Hours on assignment this week: 12hrs</w:t>
+        <w:t>Hours on assignment this week: 1</w:t>
+      </w:r>
+      <w:r>
+        <w:t>0</w:t>
+      </w:r>
+      <w:r>
+        <w:t>hrs</w:t>
       </w:r>
     </w:p>
     <w:p>
@@ -144,28 +153,7 @@
         <w:ind w:left="426"/>
       </w:pPr>
       <w:r>
-        <w:t>Generated a data dictionary and exported the cleaned dataset to multiple formats (.</w:t>
-      </w:r>
-      <w:proofErr w:type="spellStart"/>
-      <w:r>
-        <w:t>rds</w:t>
-      </w:r>
-      <w:proofErr w:type="spellEnd"/>
-      <w:r>
-        <w:t>, .xlsx, .sav</w:t>
-      </w:r>
-      <w:proofErr w:type="gramStart"/>
-      <w:r>
-        <w:t>, .</w:t>
-      </w:r>
-      <w:proofErr w:type="spellStart"/>
-      <w:r>
-        <w:t>dta</w:t>
-      </w:r>
-      <w:proofErr w:type="spellEnd"/>
-      <w:proofErr w:type="gramEnd"/>
-      <w:r>
-        <w:t>).</w:t>
+        <w:t>Generated a data dictionary and exported the cleaned dataset to multiple formats (.rds, .xlsx, .sav, .dta).</w:t>
       </w:r>
     </w:p>
     <w:p>

</xml_diff>